<commit_message>
vault backup: 2025-10-14 12:14:23
</commit_message>
<xml_diff>
--- a/学校/自然辨证法/基于问题导向探究如何提升道路病害检测智能化水平.docx
+++ b/学校/自然辨证法/基于问题导向探究如何提升道路病害检测智能化水平.docx
@@ -6,76 +6,24 @@
       <w:pPr>
         <w:jc w:val="center"/>
       </w:pPr>
-      <w:proofErr w:type="gramStart"/>
       <w:r>
         <w:rPr>
           <w:rFonts w:ascii="黑体" w:eastAsia="黑体" w:hAnsi="黑体"/>
           <w:sz w:val="36"/>
           <w:szCs w:val="36"/>
         </w:rPr>
-        <w:t>基于问题</w:t>
-      </w:r>
-      <w:proofErr w:type="gramEnd"/>
-      <w:r>
-        <w:rPr>
-          <w:rFonts w:ascii="黑体" w:eastAsia="黑体" w:hAnsi="黑体"/>
-          <w:sz w:val="36"/>
-          <w:szCs w:val="36"/>
-        </w:rPr>
-        <w:t>导向探究如何提升道路病害检测智能化水平</w:t>
+        <w:t>基于问题导向探究如何提升道路病害检测智能化水平</w:t>
       </w:r>
     </w:p>
     <w:p>
       <w:pPr>
         <w:spacing w:beforeLines="50" w:before="156" w:afterLines="50" w:after="156" w:line="240" w:lineRule="auto"/>
         <w:jc w:val="both"/>
-        <w:rPr>
-          <w:rFonts w:ascii="黑体" w:eastAsia="黑体" w:hAnsi="黑体" w:hint="eastAsia"/>
-          <w:sz w:val="32"/>
-          <w:szCs w:val="32"/>
-        </w:rPr>
-      </w:pPr>
-      <w:r>
         <w:rPr>
           <w:rFonts w:ascii="黑体" w:eastAsia="黑体" w:hAnsi="黑体"/>
           <w:sz w:val="32"/>
           <w:szCs w:val="32"/>
         </w:rPr>
-        <w:t>一、什么是问题导向</w:t>
-      </w:r>
-    </w:p>
-    <w:p>
-      <w:pPr>
-        <w:autoSpaceDE w:val="0"/>
-        <w:spacing w:beforeLines="50" w:before="156" w:afterLines="50" w:after="156" w:line="240" w:lineRule="auto"/>
-        <w:ind w:firstLineChars="200" w:firstLine="600"/>
-        <w:jc w:val="both"/>
-        <w:rPr>
-          <w:rFonts w:ascii="仿宋" w:eastAsia="仿宋" w:hAnsi="仿宋" w:cs="Times New Roman" w:hint="eastAsia"/>
-          <w:sz w:val="30"/>
-          <w:szCs w:val="30"/>
-          <w14:ligatures w14:val="none"/>
-        </w:rPr>
-      </w:pPr>
-      <w:r>
-        <w:rPr>
-          <w:rFonts w:ascii="仿宋" w:eastAsia="仿宋" w:hAnsi="仿宋" w:cs="Times New Roman" w:hint="eastAsia"/>
-          <w:sz w:val="30"/>
-          <w:szCs w:val="30"/>
-          <w14:ligatures w14:val="none"/>
-        </w:rPr>
-        <w:t>问题导向是一种以解决实际问题为核心的思维方式和工作方法。它强调从现实需求出发，通过识别、分析和定义关键问题，来引导研究方向、技术开发和方案制定。其核心优势在于能够确保研究与应用紧密结合，避免理论脱离实际，通过系统性地剖析问题的本质、成因与影响，集中资源找到最有效的解决路径，从而高效、精准地达成预期目标，推动领域的实质性进步。</w:t>
-      </w:r>
-    </w:p>
-    <w:p>
-      <w:pPr>
-        <w:spacing w:beforeLines="50" w:before="156" w:afterLines="50" w:after="156" w:line="240" w:lineRule="auto"/>
-        <w:jc w:val="both"/>
-        <w:rPr>
-          <w:rFonts w:ascii="黑体" w:eastAsia="黑体" w:hAnsi="黑体" w:hint="eastAsia"/>
-          <w:sz w:val="32"/>
-          <w:szCs w:val="32"/>
-        </w:rPr>
       </w:pPr>
       <w:r>
         <w:rPr>
@@ -83,7 +31,7 @@
           <w:sz w:val="32"/>
           <w:szCs w:val="32"/>
         </w:rPr>
-        <w:t>二、为什么要以问题导向分析道路病害检测及分析情况</w:t>
+        <w:t>一、什么是问题导向</w:t>
       </w:r>
     </w:p>
     <w:p>
@@ -93,455 +41,69 @@
         <w:ind w:firstLineChars="200" w:firstLine="600"/>
         <w:jc w:val="both"/>
         <w:rPr>
+          <w:rFonts w:ascii="仿宋" w:eastAsia="仿宋" w:hAnsi="仿宋" w:cs="Times New Roman"/>
+          <w:sz w:val="30"/>
+          <w:szCs w:val="30"/>
+          <w14:ligatures w14:val="none"/>
+        </w:rPr>
+      </w:pPr>
+      <w:r>
+        <w:rPr>
           <w:rFonts w:ascii="仿宋" w:eastAsia="仿宋" w:hAnsi="仿宋" w:cs="Times New Roman" w:hint="eastAsia"/>
           <w:sz w:val="30"/>
           <w:szCs w:val="30"/>
           <w14:ligatures w14:val="none"/>
         </w:rPr>
-      </w:pPr>
-      <w:r>
-        <w:rPr>
-          <w:rFonts w:ascii="仿宋" w:eastAsia="仿宋" w:hAnsi="仿宋" w:cs="Times New Roman"/>
-          <w:sz w:val="30"/>
-          <w:szCs w:val="30"/>
-          <w14:ligatures w14:val="none"/>
-        </w:rPr>
-        <w:t>道路病害检测：指通过技术手段对路面进行巡检，识别、分类和量化路面存在的裂缝、坑槽、沉陷、车辙等结构性或功能性损坏，为道路养护决策提供数据支持的关键环节。</w:t>
-      </w:r>
-    </w:p>
-    <w:p>
-      <w:pPr>
-        <w:autoSpaceDE w:val="0"/>
-        <w:spacing w:after="0" w:line="560" w:lineRule="exact"/>
-        <w:jc w:val="both"/>
-        <w:rPr>
-          <w:rFonts w:ascii="楷体" w:eastAsia="楷体" w:hAnsi="楷体" w:cs="Times New Roman" w:hint="eastAsia"/>
-          <w:b/>
-          <w:bCs/>
-          <w:sz w:val="32"/>
-          <w:szCs w:val="32"/>
-          <w14:ligatures w14:val="none"/>
-        </w:rPr>
-      </w:pPr>
-      <w:r>
-        <w:rPr>
-          <w:rFonts w:ascii="楷体" w:eastAsia="楷体" w:hAnsi="楷体" w:cs="Times New Roman"/>
-          <w:b/>
-          <w:bCs/>
-          <w:sz w:val="32"/>
-          <w:szCs w:val="32"/>
-          <w14:ligatures w14:val="none"/>
-        </w:rPr>
-        <w:t>（一）</w:t>
-      </w:r>
-      <w:proofErr w:type="gramStart"/>
-      <w:r>
-        <w:rPr>
-          <w:rFonts w:ascii="楷体" w:eastAsia="楷体" w:hAnsi="楷体" w:cs="Times New Roman"/>
-          <w:b/>
-          <w:bCs/>
-          <w:sz w:val="32"/>
-          <w:szCs w:val="32"/>
-          <w14:ligatures w14:val="none"/>
-        </w:rPr>
-        <w:t>基于问题</w:t>
-      </w:r>
-      <w:proofErr w:type="gramEnd"/>
-      <w:r>
-        <w:rPr>
-          <w:rFonts w:ascii="楷体" w:eastAsia="楷体" w:hAnsi="楷体" w:cs="Times New Roman"/>
-          <w:b/>
-          <w:bCs/>
-          <w:sz w:val="32"/>
-          <w:szCs w:val="32"/>
-          <w14:ligatures w14:val="none"/>
-        </w:rPr>
-        <w:t>导向分析道路病害检测的重要性。</w:t>
-      </w:r>
-    </w:p>
-    <w:p>
-      <w:pPr>
-        <w:autoSpaceDE w:val="0"/>
+        <w:t>问题导向是一种以解决实际问题为核心的思维方式和工作方法。它强调从现实需求出发，通过识别、分析和定义关键问题，来引导研究方向、技术开发和方案制定。其核心优势在于能够确保研究与应用紧密结合，避免理论脱离实际，通过系统性地剖析问题的本质、成因与影响，集中资源找到最有效的解决路径，从而高效、精准地达成预期目标，推动领域的实质性进步。</w:t>
+      </w:r>
+    </w:p>
+    <w:p>
+      <w:pPr>
         <w:spacing w:beforeLines="50" w:before="156" w:afterLines="50" w:after="156" w:line="240" w:lineRule="auto"/>
-        <w:ind w:firstLineChars="200" w:firstLine="602"/>
-        <w:jc w:val="both"/>
-        <w:rPr>
-          <w:rFonts w:ascii="仿宋" w:eastAsia="仿宋" w:hAnsi="仿宋" w:cs="Times New Roman"/>
-          <w:sz w:val="30"/>
-          <w:szCs w:val="30"/>
-          <w14:ligatures w14:val="none"/>
-        </w:rPr>
-      </w:pPr>
-      <w:r>
-        <w:rPr>
-          <w:rFonts w:ascii="仿宋" w:eastAsia="仿宋" w:hAnsi="仿宋" w:cs="Times New Roman"/>
-          <w:b/>
-          <w:bCs/>
-          <w:sz w:val="30"/>
-          <w:szCs w:val="30"/>
-          <w14:ligatures w14:val="none"/>
-        </w:rPr>
-        <w:t>一是能够明确发展目标。</w:t>
-      </w:r>
-      <w:r>
-        <w:rPr>
-          <w:rFonts w:ascii="仿宋" w:eastAsia="仿宋" w:hAnsi="仿宋" w:cs="Times New Roman"/>
-          <w:sz w:val="30"/>
-          <w:szCs w:val="30"/>
-          <w14:ligatures w14:val="none"/>
-        </w:rPr>
-        <w:t>当前道路病害检测领域面临着传统人工检测效率低、危险性高与现代智能检测技术落地难、成本高的核心矛盾。以问题为导向，能让我们精准聚焦这些关键矛盾，明确智能化提升的目标是为了实现更高效、准确、安全和经济的检测，使技术研发和应用推广更具针对性。</w:t>
-      </w:r>
-    </w:p>
-    <w:p>
-      <w:pPr>
-        <w:autoSpaceDE w:val="0"/>
-        <w:spacing w:beforeLines="50" w:before="156" w:afterLines="50" w:after="156" w:line="240" w:lineRule="auto"/>
-        <w:ind w:firstLineChars="200" w:firstLine="602"/>
-        <w:jc w:val="both"/>
-        <w:rPr>
-          <w:rFonts w:ascii="仿宋" w:eastAsia="仿宋" w:hAnsi="仿宋" w:cs="Times New Roman"/>
-          <w:sz w:val="30"/>
-          <w:szCs w:val="30"/>
-          <w14:ligatures w14:val="none"/>
-        </w:rPr>
-      </w:pPr>
-      <w:r>
-        <w:rPr>
-          <w:rFonts w:ascii="仿宋" w:eastAsia="仿宋" w:hAnsi="仿宋" w:cs="Times New Roman"/>
-          <w:b/>
-          <w:bCs/>
-          <w:sz w:val="30"/>
-          <w:szCs w:val="30"/>
-          <w14:ligatures w14:val="none"/>
-        </w:rPr>
-        <w:t>二是能够优化技术路线。</w:t>
-      </w:r>
-      <w:r>
-        <w:rPr>
-          <w:rFonts w:ascii="仿宋" w:eastAsia="仿宋" w:hAnsi="仿宋" w:cs="Times New Roman"/>
-          <w:sz w:val="30"/>
-          <w:szCs w:val="30"/>
-          <w14:ligatures w14:val="none"/>
-        </w:rPr>
-        <w:t>通过系统梳理当前智能化检测在数据采集、算法模型、数据管理和实际应用等环节存在的具体问题，</w:t>
-      </w:r>
-      <w:r>
-        <w:rPr>
-          <w:rFonts w:ascii="仿宋" w:eastAsia="仿宋" w:hAnsi="仿宋" w:cs="Times New Roman"/>
-          <w:sz w:val="30"/>
-          <w:szCs w:val="30"/>
-          <w14:ligatures w14:val="none"/>
-        </w:rPr>
-        <w:lastRenderedPageBreak/>
-        <w:t>可以有针对性地优化技术选型和研发路线。</w:t>
-      </w:r>
-    </w:p>
-    <w:p>
-      <w:pPr>
-        <w:autoSpaceDE w:val="0"/>
-        <w:spacing w:beforeLines="50" w:before="156" w:afterLines="50" w:after="156" w:line="240" w:lineRule="auto"/>
-        <w:ind w:firstLineChars="200" w:firstLine="602"/>
-        <w:jc w:val="both"/>
-        <w:rPr>
-          <w:rFonts w:ascii="仿宋" w:eastAsia="仿宋" w:hAnsi="仿宋" w:cs="Times New Roman"/>
-          <w:sz w:val="30"/>
-          <w:szCs w:val="30"/>
-          <w14:ligatures w14:val="none"/>
-        </w:rPr>
-      </w:pPr>
-      <w:r>
-        <w:rPr>
-          <w:rFonts w:ascii="仿宋" w:eastAsia="仿宋" w:hAnsi="仿宋" w:cs="Times New Roman"/>
-          <w:b/>
-          <w:bCs/>
-          <w:sz w:val="30"/>
-          <w:szCs w:val="30"/>
-          <w14:ligatures w14:val="none"/>
-        </w:rPr>
-        <w:t>三是能够提高资源利用效率。</w:t>
-      </w:r>
-      <w:r>
-        <w:rPr>
-          <w:rFonts w:ascii="仿宋" w:eastAsia="仿宋" w:hAnsi="仿宋" w:cs="Times New Roman"/>
-          <w:sz w:val="30"/>
-          <w:szCs w:val="30"/>
-          <w14:ligatures w14:val="none"/>
-        </w:rPr>
-        <w:t>这种方法有助于清</w:t>
-      </w:r>
-      <w:r>
-        <w:rPr>
-          <w:rFonts w:ascii="仿宋" w:eastAsia="仿宋" w:hAnsi="仿宋" w:cs="Times New Roman" w:hint="eastAsia"/>
-          <w:sz w:val="30"/>
-          <w:szCs w:val="30"/>
-          <w14:ligatures w14:val="none"/>
-        </w:rPr>
-        <w:t>晰地发现现有技术方案中的资源错配问题，例如过度追求检测精度导致设备成本高昂无法普及，通过解决这些问题，能够有效提升数据、算力、资金等资源的利用效率。</w:t>
-      </w:r>
-    </w:p>
-    <w:p>
-      <w:pPr>
-        <w:autoSpaceDE w:val="0"/>
-        <w:spacing w:beforeLines="50" w:before="156" w:afterLines="50" w:after="156" w:line="240" w:lineRule="auto"/>
-        <w:ind w:firstLineChars="200" w:firstLine="602"/>
-        <w:jc w:val="both"/>
-        <w:rPr>
-          <w:rFonts w:ascii="仿宋" w:eastAsia="仿宋" w:hAnsi="仿宋" w:cs="Times New Roman" w:hint="eastAsia"/>
-          <w:sz w:val="30"/>
-          <w:szCs w:val="30"/>
-          <w14:ligatures w14:val="none"/>
-        </w:rPr>
-      </w:pPr>
-      <w:r>
-        <w:rPr>
-          <w:rFonts w:ascii="仿宋" w:eastAsia="仿宋" w:hAnsi="仿宋" w:cs="Times New Roman"/>
-          <w:b/>
-          <w:bCs/>
-          <w:sz w:val="30"/>
-          <w:szCs w:val="30"/>
-          <w14:ligatures w14:val="none"/>
-        </w:rPr>
-        <w:t>四是能够保障成果转化与可持续发展。</w:t>
-      </w:r>
-      <w:r>
-        <w:rPr>
-          <w:rFonts w:ascii="仿宋" w:eastAsia="仿宋" w:hAnsi="仿宋" w:cs="Times New Roman"/>
-          <w:sz w:val="30"/>
-          <w:szCs w:val="30"/>
-          <w14:ligatures w14:val="none"/>
-        </w:rPr>
-        <w:t>以问题为导向，有助于在研发和应用过程中动态发现影响技术落地和可持续发展的瓶颈因素，并及时调整，确保技术成果能真正服务于道路养护，发挥其长远价值。</w:t>
-      </w:r>
-    </w:p>
-    <w:p>
-      <w:pPr>
-        <w:autoSpaceDE w:val="0"/>
-        <w:spacing w:after="0" w:line="560" w:lineRule="exact"/>
-        <w:jc w:val="both"/>
-        <w:rPr>
-          <w:rFonts w:ascii="楷体" w:eastAsia="楷体" w:hAnsi="楷体" w:cs="Times New Roman" w:hint="eastAsia"/>
-          <w:b/>
-          <w:bCs/>
-          <w:sz w:val="32"/>
-          <w:szCs w:val="32"/>
-          <w14:ligatures w14:val="none"/>
-        </w:rPr>
-      </w:pPr>
-      <w:r>
-        <w:rPr>
-          <w:rFonts w:ascii="楷体" w:eastAsia="楷体" w:hAnsi="楷体" w:cs="Times New Roman"/>
-          <w:b/>
-          <w:bCs/>
-          <w:sz w:val="32"/>
-          <w:szCs w:val="32"/>
-          <w14:ligatures w14:val="none"/>
-        </w:rPr>
-        <w:t>（二）道路病害智能检测领域存在的主要问题。</w:t>
-      </w:r>
-    </w:p>
-    <w:p>
-      <w:pPr>
-        <w:autoSpaceDE w:val="0"/>
-        <w:spacing w:beforeLines="50" w:before="156" w:afterLines="50" w:after="156" w:line="240" w:lineRule="auto"/>
-        <w:ind w:firstLineChars="200" w:firstLine="600"/>
-        <w:jc w:val="both"/>
-        <w:rPr>
-          <w:rFonts w:ascii="仿宋" w:eastAsia="仿宋" w:hAnsi="仿宋" w:cs="Times New Roman"/>
-          <w:sz w:val="30"/>
-          <w:szCs w:val="30"/>
-          <w14:ligatures w14:val="none"/>
-        </w:rPr>
-      </w:pPr>
-      <w:r>
-        <w:rPr>
-          <w:rFonts w:ascii="仿宋" w:eastAsia="仿宋" w:hAnsi="仿宋" w:cs="Times New Roman" w:hint="eastAsia"/>
-          <w:sz w:val="30"/>
-          <w:szCs w:val="30"/>
-          <w14:ligatures w14:val="none"/>
-        </w:rPr>
-        <w:t>当前道路病害智能检测领域存在若干突出问题。</w:t>
-      </w:r>
-    </w:p>
-    <w:p>
-      <w:pPr>
-        <w:autoSpaceDE w:val="0"/>
-        <w:spacing w:beforeLines="50" w:before="156" w:afterLines="50" w:after="156" w:line="240" w:lineRule="auto"/>
-        <w:ind w:firstLineChars="200" w:firstLine="602"/>
-        <w:jc w:val="both"/>
-        <w:rPr>
-          <w:rFonts w:ascii="仿宋" w:eastAsia="仿宋" w:hAnsi="仿宋" w:cs="Times New Roman"/>
-          <w:sz w:val="30"/>
-          <w:szCs w:val="30"/>
-          <w14:ligatures w14:val="none"/>
-        </w:rPr>
-      </w:pPr>
-      <w:r>
-        <w:rPr>
-          <w:rFonts w:ascii="仿宋" w:eastAsia="仿宋" w:hAnsi="仿宋" w:cs="Times New Roman" w:hint="eastAsia"/>
-          <w:b/>
-          <w:bCs/>
-          <w:sz w:val="30"/>
-          <w:szCs w:val="30"/>
-          <w14:ligatures w14:val="none"/>
-        </w:rPr>
-        <w:t>一是</w:t>
-      </w:r>
-      <w:r>
-        <w:rPr>
-          <w:rFonts w:ascii="仿宋" w:eastAsia="仿宋" w:hAnsi="仿宋" w:cs="Times New Roman"/>
-          <w:b/>
-          <w:bCs/>
-          <w:sz w:val="30"/>
-          <w:szCs w:val="30"/>
-          <w14:ligatures w14:val="none"/>
-        </w:rPr>
-        <w:t>数据采集面临复杂性与局限性。</w:t>
-      </w:r>
-      <w:r>
-        <w:rPr>
-          <w:rFonts w:ascii="仿宋" w:eastAsia="仿宋" w:hAnsi="仿宋" w:cs="Times New Roman"/>
-          <w:sz w:val="30"/>
-          <w:szCs w:val="30"/>
-          <w14:ligatures w14:val="none"/>
-        </w:rPr>
-        <w:t>道路环境复杂多变，光照变化、阴影遮挡、路面水渍等因素严重影响图像和数据的质量，现有采集设备在适应不同天气和路况的作业能力上仍有不足。</w:t>
-      </w:r>
-    </w:p>
-    <w:p>
-      <w:pPr>
-        <w:autoSpaceDE w:val="0"/>
-        <w:spacing w:beforeLines="50" w:before="156" w:afterLines="50" w:after="156" w:line="240" w:lineRule="auto"/>
-        <w:ind w:firstLineChars="200" w:firstLine="602"/>
-        <w:jc w:val="both"/>
-        <w:rPr>
-          <w:rFonts w:ascii="仿宋" w:eastAsia="仿宋" w:hAnsi="仿宋" w:cs="Times New Roman"/>
-          <w:sz w:val="30"/>
-          <w:szCs w:val="30"/>
-          <w14:ligatures w14:val="none"/>
-        </w:rPr>
-      </w:pPr>
-      <w:r>
-        <w:rPr>
-          <w:rFonts w:ascii="仿宋" w:eastAsia="仿宋" w:hAnsi="仿宋" w:cs="Times New Roman" w:hint="eastAsia"/>
-          <w:b/>
-          <w:bCs/>
-          <w:sz w:val="30"/>
-          <w:szCs w:val="30"/>
-          <w14:ligatures w14:val="none"/>
-        </w:rPr>
-        <w:t>二是</w:t>
-      </w:r>
-      <w:r>
-        <w:rPr>
-          <w:rFonts w:ascii="仿宋" w:eastAsia="仿宋" w:hAnsi="仿宋" w:cs="Times New Roman"/>
-          <w:b/>
-          <w:bCs/>
-          <w:sz w:val="30"/>
-          <w:szCs w:val="30"/>
-          <w14:ligatures w14:val="none"/>
-        </w:rPr>
-        <w:t>算法模型的泛化能力与精度存在瓶颈。</w:t>
-      </w:r>
-      <w:r>
-        <w:rPr>
-          <w:rFonts w:ascii="仿宋" w:eastAsia="仿宋" w:hAnsi="仿宋" w:cs="Times New Roman"/>
-          <w:sz w:val="30"/>
-          <w:szCs w:val="30"/>
-          <w14:ligatures w14:val="none"/>
-        </w:rPr>
-        <w:t>尽管基于深度学习的算法取得了显著进展，但模型在新的环境下的性能会显著下降，且对于微小裂缝、形态不规则病害的识别精度仍有待提升。再次，数据与业务的融合存在障碍。检测技术产生的大量数据未能与道路养护管理业务有效融合，缺乏统一的数据标准，形成了“</w:t>
-      </w:r>
-      <w:r>
-        <w:rPr>
-          <w:rFonts w:ascii="仿宋" w:eastAsia="仿宋" w:hAnsi="仿宋" w:cs="Times New Roman" w:hint="eastAsia"/>
-          <w:sz w:val="30"/>
-          <w:szCs w:val="30"/>
-          <w14:ligatures w14:val="none"/>
-        </w:rPr>
-        <w:t>数据孤岛”，从“检测”到“决策”的智能闭环尚未打通。</w:t>
-      </w:r>
-    </w:p>
-    <w:p>
-      <w:pPr>
-        <w:autoSpaceDE w:val="0"/>
-        <w:spacing w:beforeLines="50" w:before="156" w:afterLines="50" w:after="156" w:line="240" w:lineRule="auto"/>
-        <w:ind w:firstLineChars="200" w:firstLine="602"/>
-        <w:jc w:val="both"/>
-        <w:rPr>
-          <w:rFonts w:ascii="仿宋" w:eastAsia="仿宋" w:hAnsi="仿宋" w:cs="Times New Roman" w:hint="eastAsia"/>
-          <w:sz w:val="30"/>
-          <w:szCs w:val="30"/>
-          <w14:ligatures w14:val="none"/>
-        </w:rPr>
-      </w:pPr>
-      <w:r>
-        <w:rPr>
-          <w:rFonts w:ascii="仿宋" w:eastAsia="仿宋" w:hAnsi="仿宋" w:cs="Times New Roman" w:hint="eastAsia"/>
-          <w:b/>
-          <w:bCs/>
-          <w:sz w:val="30"/>
-          <w:szCs w:val="30"/>
-          <w14:ligatures w14:val="none"/>
-        </w:rPr>
-        <w:lastRenderedPageBreak/>
-        <w:t>三是</w:t>
-      </w:r>
-      <w:r>
-        <w:rPr>
-          <w:rFonts w:ascii="仿宋" w:eastAsia="仿宋" w:hAnsi="仿宋" w:cs="Times New Roman"/>
-          <w:b/>
-          <w:bCs/>
-          <w:sz w:val="30"/>
-          <w:szCs w:val="30"/>
-          <w14:ligatures w14:val="none"/>
-        </w:rPr>
-        <w:t>成本与效益的平衡成为推广的关键难题。</w:t>
-      </w:r>
-      <w:r>
-        <w:rPr>
-          <w:rFonts w:ascii="仿宋" w:eastAsia="仿宋" w:hAnsi="仿宋" w:cs="Times New Roman"/>
-          <w:sz w:val="30"/>
-          <w:szCs w:val="30"/>
-          <w14:ligatures w14:val="none"/>
-        </w:rPr>
-        <w:t>高精度的自动化检测设备通常价格不菲，这限制了技术在广大中低等级公路中的大规模推广应用。</w:t>
-      </w:r>
-    </w:p>
-    <w:p>
-      <w:pPr>
-        <w:spacing w:beforeLines="50" w:before="156" w:afterLines="50" w:after="156" w:line="240" w:lineRule="auto"/>
-        <w:jc w:val="both"/>
-        <w:rPr>
-          <w:rFonts w:ascii="黑体" w:eastAsia="黑体" w:hAnsi="黑体" w:hint="eastAsia"/>
-          <w:sz w:val="32"/>
-          <w:szCs w:val="32"/>
-        </w:rPr>
-      </w:pPr>
-      <w:r>
+        <w:jc w:val="both"/>
         <w:rPr>
           <w:rFonts w:ascii="黑体" w:eastAsia="黑体" w:hAnsi="黑体"/>
           <w:sz w:val="32"/>
           <w:szCs w:val="32"/>
         </w:rPr>
-        <w:t>三、如何建设高质量的道路病害智能检测体系</w:t>
-      </w:r>
-    </w:p>
-    <w:p>
-      <w:pPr>
-        <w:autoSpaceDE w:val="0"/>
-        <w:spacing w:after="0" w:line="560" w:lineRule="exact"/>
-        <w:jc w:val="both"/>
-        <w:rPr>
-          <w:rFonts w:ascii="楷体" w:eastAsia="楷体" w:hAnsi="楷体" w:cs="Times New Roman" w:hint="eastAsia"/>
-          <w:b/>
-          <w:bCs/>
+      </w:pPr>
+      <w:r>
+        <w:rPr>
+          <w:rFonts w:ascii="黑体" w:eastAsia="黑体" w:hAnsi="黑体"/>
           <w:sz w:val="32"/>
           <w:szCs w:val="32"/>
-          <w14:ligatures w14:val="none"/>
-        </w:rPr>
-      </w:pPr>
-      <w:r>
+        </w:rPr>
+        <w:t>二、为什么要以问题导向分析道路病害检测及分析情况</w:t>
+      </w:r>
+    </w:p>
+    <w:p>
+      <w:pPr>
+        <w:autoSpaceDE w:val="0"/>
+        <w:spacing w:beforeLines="50" w:before="156" w:afterLines="50" w:after="156" w:line="240" w:lineRule="auto"/>
+        <w:ind w:firstLineChars="200" w:firstLine="600"/>
+        <w:jc w:val="both"/>
+        <w:rPr>
+          <w:rFonts w:ascii="仿宋" w:eastAsia="仿宋" w:hAnsi="仿宋" w:cs="Times New Roman"/>
+          <w:sz w:val="30"/>
+          <w:szCs w:val="30"/>
+          <w14:ligatures w14:val="none"/>
+        </w:rPr>
+      </w:pPr>
+      <w:r>
+        <w:rPr>
+          <w:rFonts w:ascii="仿宋" w:eastAsia="仿宋" w:hAnsi="仿宋" w:cs="Times New Roman"/>
+          <w:sz w:val="30"/>
+          <w:szCs w:val="30"/>
+          <w14:ligatures w14:val="none"/>
+        </w:rPr>
+        <w:t>道路病害检测指通过技术手段对路面进行巡检，识别、分类和量化路面存在的裂缝、坑槽、沉陷、车辙等结构性或功能性损坏，为道路养护决策提供数据支持的关键环节。</w:t>
+      </w:r>
+    </w:p>
+    <w:p>
+      <w:pPr>
+        <w:autoSpaceDE w:val="0"/>
+        <w:spacing w:after="0" w:line="560" w:lineRule="exact"/>
+        <w:jc w:val="both"/>
         <w:rPr>
           <w:rFonts w:ascii="楷体" w:eastAsia="楷体" w:hAnsi="楷体" w:cs="Times New Roman"/>
           <w:b/>
@@ -550,7 +112,198 @@
           <w:szCs w:val="32"/>
           <w14:ligatures w14:val="none"/>
         </w:rPr>
-        <w:t>（一）指导思想</w:t>
+      </w:pPr>
+      <w:r>
+        <w:rPr>
+          <w:rFonts w:ascii="楷体" w:eastAsia="楷体" w:hAnsi="楷体" w:cs="Times New Roman"/>
+          <w:b/>
+          <w:bCs/>
+          <w:sz w:val="32"/>
+          <w:szCs w:val="32"/>
+          <w14:ligatures w14:val="none"/>
+        </w:rPr>
+        <w:t>（一）基于问题导向分析道路病害检测的重要性。</w:t>
+      </w:r>
+    </w:p>
+    <w:p>
+      <w:pPr>
+        <w:autoSpaceDE w:val="0"/>
+        <w:spacing w:beforeLines="50" w:before="156" w:afterLines="50" w:after="156" w:line="240" w:lineRule="auto"/>
+        <w:ind w:firstLineChars="200" w:firstLine="602"/>
+        <w:jc w:val="both"/>
+        <w:rPr>
+          <w:rFonts w:ascii="仿宋" w:eastAsia="仿宋" w:hAnsi="仿宋" w:cs="Times New Roman"/>
+          <w:sz w:val="30"/>
+          <w:szCs w:val="30"/>
+          <w14:ligatures w14:val="none"/>
+        </w:rPr>
+      </w:pPr>
+      <w:r>
+        <w:rPr>
+          <w:rFonts w:ascii="仿宋" w:eastAsia="仿宋" w:hAnsi="仿宋" w:cs="Times New Roman"/>
+          <w:b/>
+          <w:bCs/>
+          <w:sz w:val="30"/>
+          <w:szCs w:val="30"/>
+          <w14:ligatures w14:val="none"/>
+        </w:rPr>
+        <w:t>一是能够明确发展目标。</w:t>
+      </w:r>
+      <w:r>
+        <w:rPr>
+          <w:rFonts w:ascii="仿宋" w:eastAsia="仿宋" w:hAnsi="仿宋" w:cs="Times New Roman"/>
+          <w:sz w:val="30"/>
+          <w:szCs w:val="30"/>
+          <w14:ligatures w14:val="none"/>
+        </w:rPr>
+        <w:t>当前道路病害检测领域面临着传统人工检测效率低、危险性高与现代智能检测技术落地难、成本高的核心矛盾。以问题为导向，能让我们精准聚焦这些关键矛盾，明确智能化提升的目标是为了实现更高效、准确、安全和经济的检测，使技术研发和应用推广更具针对性。</w:t>
+      </w:r>
+    </w:p>
+    <w:p>
+      <w:pPr>
+        <w:autoSpaceDE w:val="0"/>
+        <w:spacing w:beforeLines="50" w:before="156" w:afterLines="50" w:after="156" w:line="240" w:lineRule="auto"/>
+        <w:ind w:firstLineChars="200" w:firstLine="602"/>
+        <w:jc w:val="both"/>
+        <w:rPr>
+          <w:rFonts w:ascii="仿宋" w:eastAsia="仿宋" w:hAnsi="仿宋" w:cs="Times New Roman"/>
+          <w:sz w:val="30"/>
+          <w:szCs w:val="30"/>
+          <w14:ligatures w14:val="none"/>
+        </w:rPr>
+      </w:pPr>
+      <w:r>
+        <w:rPr>
+          <w:rFonts w:ascii="仿宋" w:eastAsia="仿宋" w:hAnsi="仿宋" w:cs="Times New Roman"/>
+          <w:b/>
+          <w:bCs/>
+          <w:sz w:val="30"/>
+          <w:szCs w:val="30"/>
+          <w14:ligatures w14:val="none"/>
+        </w:rPr>
+        <w:t>二是能够优化技术路线。</w:t>
+      </w:r>
+      <w:r>
+        <w:rPr>
+          <w:rFonts w:ascii="仿宋" w:eastAsia="仿宋" w:hAnsi="仿宋" w:cs="Times New Roman"/>
+          <w:sz w:val="30"/>
+          <w:szCs w:val="30"/>
+          <w14:ligatures w14:val="none"/>
+        </w:rPr>
+        <w:t>通过系统梳理当前智能化检测在数据采集、算法模型、数据管理和实际应用等环节存在的具体问题，</w:t>
+      </w:r>
+      <w:r>
+        <w:rPr>
+          <w:rFonts w:ascii="仿宋" w:eastAsia="仿宋" w:hAnsi="仿宋" w:cs="Times New Roman"/>
+          <w:sz w:val="30"/>
+          <w:szCs w:val="30"/>
+          <w14:ligatures w14:val="none"/>
+        </w:rPr>
+        <w:lastRenderedPageBreak/>
+        <w:t>可以有针对性地优化技术选型和研发路线。</w:t>
+      </w:r>
+    </w:p>
+    <w:p>
+      <w:pPr>
+        <w:autoSpaceDE w:val="0"/>
+        <w:spacing w:beforeLines="50" w:before="156" w:afterLines="50" w:after="156" w:line="240" w:lineRule="auto"/>
+        <w:ind w:firstLineChars="200" w:firstLine="602"/>
+        <w:jc w:val="both"/>
+        <w:rPr>
+          <w:rFonts w:ascii="仿宋" w:eastAsia="仿宋" w:hAnsi="仿宋" w:cs="Times New Roman"/>
+          <w:sz w:val="30"/>
+          <w:szCs w:val="30"/>
+          <w14:ligatures w14:val="none"/>
+        </w:rPr>
+      </w:pPr>
+      <w:r>
+        <w:rPr>
+          <w:rFonts w:ascii="仿宋" w:eastAsia="仿宋" w:hAnsi="仿宋" w:cs="Times New Roman"/>
+          <w:b/>
+          <w:bCs/>
+          <w:sz w:val="30"/>
+          <w:szCs w:val="30"/>
+          <w14:ligatures w14:val="none"/>
+        </w:rPr>
+        <w:t>三是能够提高资源利用效率。</w:t>
+      </w:r>
+      <w:r>
+        <w:rPr>
+          <w:rFonts w:ascii="仿宋" w:eastAsia="仿宋" w:hAnsi="仿宋" w:cs="Times New Roman"/>
+          <w:sz w:val="30"/>
+          <w:szCs w:val="30"/>
+          <w14:ligatures w14:val="none"/>
+        </w:rPr>
+        <w:t>这种方法有助于清</w:t>
+      </w:r>
+      <w:r>
+        <w:rPr>
+          <w:rFonts w:ascii="仿宋" w:eastAsia="仿宋" w:hAnsi="仿宋" w:cs="Times New Roman" w:hint="eastAsia"/>
+          <w:sz w:val="30"/>
+          <w:szCs w:val="30"/>
+          <w14:ligatures w14:val="none"/>
+        </w:rPr>
+        <w:t>晰地发现现有技术方案中的资源错配问题，例如过度追求检测精度导致设备成本高昂无法普及，通过解决这些问题，能够有效提升数据、算力、资金等资源的利用效率。</w:t>
+      </w:r>
+    </w:p>
+    <w:p>
+      <w:pPr>
+        <w:autoSpaceDE w:val="0"/>
+        <w:spacing w:beforeLines="50" w:before="156" w:afterLines="50" w:after="156" w:line="240" w:lineRule="auto"/>
+        <w:ind w:firstLineChars="200" w:firstLine="602"/>
+        <w:jc w:val="both"/>
+        <w:rPr>
+          <w:rFonts w:ascii="仿宋" w:eastAsia="仿宋" w:hAnsi="仿宋" w:cs="Times New Roman"/>
+          <w:sz w:val="30"/>
+          <w:szCs w:val="30"/>
+          <w14:ligatures w14:val="none"/>
+        </w:rPr>
+      </w:pPr>
+      <w:r>
+        <w:rPr>
+          <w:rFonts w:ascii="仿宋" w:eastAsia="仿宋" w:hAnsi="仿宋" w:cs="Times New Roman"/>
+          <w:b/>
+          <w:bCs/>
+          <w:sz w:val="30"/>
+          <w:szCs w:val="30"/>
+          <w14:ligatures w14:val="none"/>
+        </w:rPr>
+        <w:t>四是能够保障成果转化与可持续发展。</w:t>
+      </w:r>
+      <w:r>
+        <w:rPr>
+          <w:rFonts w:ascii="仿宋" w:eastAsia="仿宋" w:hAnsi="仿宋" w:cs="Times New Roman"/>
+          <w:sz w:val="30"/>
+          <w:szCs w:val="30"/>
+          <w14:ligatures w14:val="none"/>
+        </w:rPr>
+        <w:t>以问题为导向，有助于在研发和应用过程中动态发现影响技术落地和可持续发展的瓶颈因素，并及时调整，确保技术成果能真正服务于道路养护，发挥其长远价值。</w:t>
+      </w:r>
+    </w:p>
+    <w:p>
+      <w:pPr>
+        <w:autoSpaceDE w:val="0"/>
+        <w:spacing w:after="0" w:line="560" w:lineRule="exact"/>
+        <w:jc w:val="both"/>
+        <w:rPr>
+          <w:rFonts w:ascii="楷体" w:eastAsia="楷体" w:hAnsi="楷体" w:cs="Times New Roman"/>
+          <w:b/>
+          <w:bCs/>
+          <w:sz w:val="32"/>
+          <w:szCs w:val="32"/>
+          <w14:ligatures w14:val="none"/>
+        </w:rPr>
+      </w:pPr>
+      <w:r>
+        <w:rPr>
+          <w:rFonts w:ascii="楷体" w:eastAsia="楷体" w:hAnsi="楷体" w:cs="Times New Roman"/>
+          <w:b/>
+          <w:bCs/>
+          <w:sz w:val="32"/>
+          <w:szCs w:val="32"/>
+          <w14:ligatures w14:val="none"/>
+        </w:rPr>
+        <w:t>（二）道路病害智能检测领域存在的主要问题。</w:t>
       </w:r>
     </w:p>
     <w:p>
@@ -560,21 +313,80 @@
         <w:ind w:firstLineChars="200" w:firstLine="600"/>
         <w:jc w:val="both"/>
         <w:rPr>
+          <w:rFonts w:ascii="仿宋" w:eastAsia="仿宋" w:hAnsi="仿宋" w:cs="Times New Roman"/>
+          <w:sz w:val="30"/>
+          <w:szCs w:val="30"/>
+          <w14:ligatures w14:val="none"/>
+        </w:rPr>
+      </w:pPr>
+      <w:r>
+        <w:rPr>
           <w:rFonts w:ascii="仿宋" w:eastAsia="仿宋" w:hAnsi="仿宋" w:cs="Times New Roman" w:hint="eastAsia"/>
           <w:sz w:val="30"/>
           <w:szCs w:val="30"/>
           <w14:ligatures w14:val="none"/>
         </w:rPr>
+        <w:t>当前道路病害智能检测领域存在若干突出问题。</w:t>
+      </w:r>
+    </w:p>
+    <w:p>
+      <w:pPr>
+        <w:autoSpaceDE w:val="0"/>
+        <w:spacing w:beforeLines="50" w:before="156" w:afterLines="50" w:after="156" w:line="240" w:lineRule="auto"/>
+        <w:ind w:firstLineChars="200" w:firstLine="602"/>
+        <w:jc w:val="both"/>
+        <w:rPr>
+          <w:rFonts w:ascii="仿宋" w:eastAsia="仿宋" w:hAnsi="仿宋" w:cs="Times New Roman"/>
+          <w:sz w:val="30"/>
+          <w:szCs w:val="30"/>
+          <w14:ligatures w14:val="none"/>
+        </w:rPr>
       </w:pPr>
       <w:r>
         <w:rPr>
           <w:rFonts w:ascii="仿宋" w:eastAsia="仿宋" w:hAnsi="仿宋" w:cs="Times New Roman" w:hint="eastAsia"/>
-          <w:sz w:val="30"/>
-          <w:szCs w:val="30"/>
-          <w14:ligatures w14:val="none"/>
-        </w:rPr>
-        <w:t>以“交通强国”战略为指引，面向国家对基础设施智慧运维的重大需求，以提升道路资产管理效率、保障交通运行安全为核心目标。</w:t>
-      </w:r>
+          <w:b/>
+          <w:bCs/>
+          <w:sz w:val="30"/>
+          <w:szCs w:val="30"/>
+          <w14:ligatures w14:val="none"/>
+        </w:rPr>
+        <w:t>一是</w:t>
+      </w:r>
+      <w:r>
+        <w:rPr>
+          <w:rFonts w:ascii="仿宋" w:eastAsia="仿宋" w:hAnsi="仿宋" w:cs="Times New Roman"/>
+          <w:b/>
+          <w:bCs/>
+          <w:sz w:val="30"/>
+          <w:szCs w:val="30"/>
+          <w14:ligatures w14:val="none"/>
+        </w:rPr>
+        <w:t>数据采集面临复杂性与局限性。</w:t>
+      </w:r>
+      <w:r>
+        <w:rPr>
+          <w:rFonts w:ascii="仿宋" w:eastAsia="仿宋" w:hAnsi="仿宋" w:cs="Times New Roman"/>
+          <w:sz w:val="30"/>
+          <w:szCs w:val="30"/>
+          <w14:ligatures w14:val="none"/>
+        </w:rPr>
+        <w:t>道路环境复杂多变，光照变化、阴影遮挡、路面水渍等因素严重影响图像和数据的质量，现有采集设备在适应不同天气和路况的作业能力上仍有不足。</w:t>
+      </w:r>
+    </w:p>
+    <w:p>
+      <w:pPr>
+        <w:autoSpaceDE w:val="0"/>
+        <w:spacing w:beforeLines="50" w:before="156" w:afterLines="50" w:after="156" w:line="240" w:lineRule="auto"/>
+        <w:ind w:firstLineChars="200" w:firstLine="602"/>
+        <w:jc w:val="both"/>
+        <w:rPr>
+          <w:rFonts w:ascii="仿宋" w:eastAsia="仿宋" w:hAnsi="仿宋" w:cs="Times New Roman"/>
+          <w:sz w:val="30"/>
+          <w:szCs w:val="30"/>
+          <w14:ligatures w14:val="none"/>
+        </w:rPr>
+      </w:pPr>
       <w:r>
         <w:rPr>
           <w:rFonts w:ascii="仿宋" w:eastAsia="仿宋" w:hAnsi="仿宋" w:cs="Times New Roman" w:hint="eastAsia"/>
@@ -584,7 +396,27 @@
           <w:szCs w:val="30"/>
           <w14:ligatures w14:val="none"/>
         </w:rPr>
-        <w:t>依托人工智能、大数据等新一代信息技术，</w:t>
+        <w:t>二是</w:t>
+      </w:r>
+      <w:r>
+        <w:rPr>
+          <w:rFonts w:ascii="仿宋" w:eastAsia="仿宋" w:hAnsi="仿宋" w:cs="Times New Roman"/>
+          <w:b/>
+          <w:bCs/>
+          <w:sz w:val="30"/>
+          <w:szCs w:val="30"/>
+          <w14:ligatures w14:val="none"/>
+        </w:rPr>
+        <w:t>算法模型的泛化能力与精度存在瓶颈。</w:t>
+      </w:r>
+      <w:r>
+        <w:rPr>
+          <w:rFonts w:ascii="仿宋" w:eastAsia="仿宋" w:hAnsi="仿宋" w:cs="Times New Roman"/>
+          <w:sz w:val="30"/>
+          <w:szCs w:val="30"/>
+          <w14:ligatures w14:val="none"/>
+        </w:rPr>
+        <w:t>尽管基于深度学习的算法取得了显著进展，但模型在新的环境下的性能会显著下降，且对于微小裂缝、形态不规则病害的识别精度仍有待提升。再次，数据与业务的融合存在障碍。检测技术产生的大量数据未能与道路养护管理业务有效融合，缺乏统一的数据标准，形成了“</w:t>
       </w:r>
       <w:r>
         <w:rPr>
@@ -593,33 +425,98 @@
           <w:szCs w:val="30"/>
           <w14:ligatures w14:val="none"/>
         </w:rPr>
-        <w:t>因地制宜地构建覆盖全面、数据驱动、智能高效的道路病害检测与评估体系，满足不同等级道路在全生命周期内的精细化养护需求，为建设现代化、高质量的公路交通网络提供坚实技术支撑。</w:t>
-      </w:r>
-    </w:p>
-    <w:p>
-      <w:pPr>
-        <w:autoSpaceDE w:val="0"/>
-        <w:spacing w:after="0" w:line="560" w:lineRule="exact"/>
-        <w:jc w:val="both"/>
-        <w:rPr>
-          <w:rFonts w:ascii="楷体" w:eastAsia="楷体" w:hAnsi="楷体" w:cs="Times New Roman" w:hint="eastAsia"/>
-          <w:b/>
-          <w:bCs/>
+        <w:t>数据孤岛”，从“检测”到“决策”的智能闭环尚未打通。</w:t>
+      </w:r>
+    </w:p>
+    <w:p>
+      <w:pPr>
+        <w:autoSpaceDE w:val="0"/>
+        <w:spacing w:beforeLines="50" w:before="156" w:afterLines="50" w:after="156" w:line="240" w:lineRule="auto"/>
+        <w:ind w:firstLineChars="200" w:firstLine="602"/>
+        <w:jc w:val="both"/>
+        <w:rPr>
+          <w:rFonts w:ascii="仿宋" w:eastAsia="仿宋" w:hAnsi="仿宋" w:cs="Times New Roman"/>
+          <w:sz w:val="30"/>
+          <w:szCs w:val="30"/>
+          <w14:ligatures w14:val="none"/>
+        </w:rPr>
+      </w:pPr>
+      <w:r>
+        <w:rPr>
+          <w:rFonts w:ascii="仿宋" w:eastAsia="仿宋" w:hAnsi="仿宋" w:cs="Times New Roman" w:hint="eastAsia"/>
+          <w:b/>
+          <w:bCs/>
+          <w:sz w:val="30"/>
+          <w:szCs w:val="30"/>
+          <w14:ligatures w14:val="none"/>
+        </w:rPr>
+        <w:lastRenderedPageBreak/>
+        <w:t>三是</w:t>
+      </w:r>
+      <w:r>
+        <w:rPr>
+          <w:rFonts w:ascii="仿宋" w:eastAsia="仿宋" w:hAnsi="仿宋" w:cs="Times New Roman"/>
+          <w:b/>
+          <w:bCs/>
+          <w:sz w:val="30"/>
+          <w:szCs w:val="30"/>
+          <w14:ligatures w14:val="none"/>
+        </w:rPr>
+        <w:t>成本与效益的平衡成为推广的关键难题。</w:t>
+      </w:r>
+      <w:r>
+        <w:rPr>
+          <w:rFonts w:ascii="仿宋" w:eastAsia="仿宋" w:hAnsi="仿宋" w:cs="Times New Roman"/>
+          <w:sz w:val="30"/>
+          <w:szCs w:val="30"/>
+          <w14:ligatures w14:val="none"/>
+        </w:rPr>
+        <w:t>高精度的自动化检测设备通常价格不菲，这限制了技术在广大中低等级公路中的大规模推广应用。</w:t>
+      </w:r>
+    </w:p>
+    <w:p>
+      <w:pPr>
+        <w:spacing w:beforeLines="50" w:before="156" w:afterLines="50" w:after="156" w:line="240" w:lineRule="auto"/>
+        <w:jc w:val="both"/>
+        <w:rPr>
+          <w:rFonts w:ascii="黑体" w:eastAsia="黑体" w:hAnsi="黑体"/>
           <w:sz w:val="32"/>
           <w:szCs w:val="32"/>
-          <w14:ligatures w14:val="none"/>
-        </w:rPr>
-      </w:pPr>
-      <w:r>
-        <w:rPr>
-          <w:rFonts w:ascii="楷体" w:eastAsia="楷体" w:hAnsi="楷体" w:cs="Times New Roman"/>
-          <w:b/>
-          <w:bCs/>
+        </w:rPr>
+      </w:pPr>
+      <w:r>
+        <w:rPr>
+          <w:rFonts w:ascii="黑体" w:eastAsia="黑体" w:hAnsi="黑体"/>
           <w:sz w:val="32"/>
           <w:szCs w:val="32"/>
-          <w14:ligatures w14:val="none"/>
-        </w:rPr>
-        <w:t>（二）基本原则</w:t>
+        </w:rPr>
+        <w:t>三、如何建设高质量的道路病害智能检测体系</w:t>
+      </w:r>
+    </w:p>
+    <w:p>
+      <w:pPr>
+        <w:autoSpaceDE w:val="0"/>
+        <w:spacing w:after="0" w:line="560" w:lineRule="exact"/>
+        <w:jc w:val="both"/>
+        <w:rPr>
+          <w:rFonts w:ascii="楷体" w:eastAsia="楷体" w:hAnsi="楷体" w:cs="Times New Roman"/>
+          <w:b/>
+          <w:bCs/>
+          <w:sz w:val="32"/>
+          <w:szCs w:val="32"/>
+          <w14:ligatures w14:val="none"/>
+        </w:rPr>
+      </w:pPr>
+      <w:r>
+        <w:rPr>
+          <w:rFonts w:ascii="楷体" w:eastAsia="楷体" w:hAnsi="楷体" w:cs="Times New Roman"/>
+          <w:b/>
+          <w:bCs/>
+          <w:sz w:val="32"/>
+          <w:szCs w:val="32"/>
+          <w14:ligatures w14:val="none"/>
+        </w:rPr>
+        <w:t>（一）指导思想</w:t>
       </w:r>
     </w:p>
     <w:p>
@@ -642,6 +539,75 @@
           <w:szCs w:val="30"/>
           <w14:ligatures w14:val="none"/>
         </w:rPr>
+        <w:t>以“交通强国”战略为指引，面向国家对基础设施智慧运维的重大需求，以提升道路资产管理效率、保障交通运行安全为核心目标。</w:t>
+      </w:r>
+      <w:r>
+        <w:rPr>
+          <w:rFonts w:ascii="仿宋" w:eastAsia="仿宋" w:hAnsi="仿宋" w:cs="Times New Roman" w:hint="eastAsia"/>
+          <w:b/>
+          <w:bCs/>
+          <w:sz w:val="30"/>
+          <w:szCs w:val="30"/>
+          <w14:ligatures w14:val="none"/>
+        </w:rPr>
+        <w:t>依托人工智能、大数据等新一代信息技术，</w:t>
+      </w:r>
+      <w:r>
+        <w:rPr>
+          <w:rFonts w:ascii="仿宋" w:eastAsia="仿宋" w:hAnsi="仿宋" w:cs="Times New Roman" w:hint="eastAsia"/>
+          <w:sz w:val="30"/>
+          <w:szCs w:val="30"/>
+          <w14:ligatures w14:val="none"/>
+        </w:rPr>
+        <w:t>因地制宜地构建覆盖全面、数据驱动、智能高效的道路病害检测与评估体系，满足不同等级道路在全生命周期内的精细化养护需求，为建设现代化、高质量的公路交通网络提供坚实技术支撑。</w:t>
+      </w:r>
+    </w:p>
+    <w:p>
+      <w:pPr>
+        <w:autoSpaceDE w:val="0"/>
+        <w:spacing w:after="0" w:line="560" w:lineRule="exact"/>
+        <w:jc w:val="both"/>
+        <w:rPr>
+          <w:rFonts w:ascii="楷体" w:eastAsia="楷体" w:hAnsi="楷体" w:cs="Times New Roman"/>
+          <w:b/>
+          <w:bCs/>
+          <w:sz w:val="32"/>
+          <w:szCs w:val="32"/>
+          <w14:ligatures w14:val="none"/>
+        </w:rPr>
+      </w:pPr>
+      <w:r>
+        <w:rPr>
+          <w:rFonts w:ascii="楷体" w:eastAsia="楷体" w:hAnsi="楷体" w:cs="Times New Roman"/>
+          <w:b/>
+          <w:bCs/>
+          <w:sz w:val="32"/>
+          <w:szCs w:val="32"/>
+          <w14:ligatures w14:val="none"/>
+        </w:rPr>
+        <w:t>（二）基本原则</w:t>
+      </w:r>
+    </w:p>
+    <w:p>
+      <w:pPr>
+        <w:autoSpaceDE w:val="0"/>
+        <w:spacing w:beforeLines="50" w:before="156" w:afterLines="50" w:after="156" w:line="240" w:lineRule="auto"/>
+        <w:ind w:firstLineChars="200" w:firstLine="600"/>
+        <w:jc w:val="both"/>
+        <w:rPr>
+          <w:rFonts w:ascii="仿宋" w:eastAsia="仿宋" w:hAnsi="仿宋" w:cs="Times New Roman"/>
+          <w:sz w:val="30"/>
+          <w:szCs w:val="30"/>
+          <w14:ligatures w14:val="none"/>
+        </w:rPr>
+      </w:pPr>
+      <w:r>
+        <w:rPr>
+          <w:rFonts w:ascii="仿宋" w:eastAsia="仿宋" w:hAnsi="仿宋" w:cs="Times New Roman" w:hint="eastAsia"/>
+          <w:sz w:val="30"/>
+          <w:szCs w:val="30"/>
+          <w14:ligatures w14:val="none"/>
+        </w:rPr>
         <w:t>为建设高质量的检测体系，应遵循几项基本原则。</w:t>
       </w:r>
     </w:p>
@@ -797,71 +763,51 @@
         <w:ind w:firstLineChars="200" w:firstLine="602"/>
         <w:jc w:val="both"/>
         <w:rPr>
+          <w:rFonts w:ascii="仿宋" w:eastAsia="仿宋" w:hAnsi="仿宋" w:cs="Times New Roman"/>
+          <w:sz w:val="30"/>
+          <w:szCs w:val="30"/>
+          <w14:ligatures w14:val="none"/>
+        </w:rPr>
+      </w:pPr>
+      <w:r>
+        <w:rPr>
           <w:rFonts w:ascii="仿宋" w:eastAsia="仿宋" w:hAnsi="仿宋" w:cs="Times New Roman" w:hint="eastAsia"/>
-          <w:sz w:val="30"/>
-          <w:szCs w:val="30"/>
-          <w14:ligatures w14:val="none"/>
-        </w:rPr>
-      </w:pPr>
+          <w:b/>
+          <w:bCs/>
+          <w:sz w:val="30"/>
+          <w:szCs w:val="30"/>
+          <w14:ligatures w14:val="none"/>
+        </w:rPr>
+        <w:t>四是</w:t>
+      </w:r>
+      <w:r>
+        <w:rPr>
+          <w:rFonts w:ascii="仿宋" w:eastAsia="仿宋" w:hAnsi="仿宋" w:cs="Times New Roman"/>
+          <w:b/>
+          <w:bCs/>
+          <w:sz w:val="30"/>
+          <w:szCs w:val="30"/>
+          <w14:ligatures w14:val="none"/>
+        </w:rPr>
+        <w:t>坚持安全经济，</w:t>
+      </w:r>
+      <w:r>
+        <w:rPr>
+          <w:rFonts w:ascii="仿宋" w:eastAsia="仿宋" w:hAnsi="仿宋" w:cs="Times New Roman"/>
+          <w:sz w:val="30"/>
+          <w:szCs w:val="30"/>
+          <w14:ligatures w14:val="none"/>
+        </w:rPr>
+        <w:t>大力发展非接触、自动化检测技术，降低作业风险</w:t>
+      </w:r>
       <w:r>
         <w:rPr>
           <w:rFonts w:ascii="仿宋" w:eastAsia="仿宋" w:hAnsi="仿宋" w:cs="Times New Roman" w:hint="eastAsia"/>
-          <w:b/>
-          <w:bCs/>
-          <w:sz w:val="30"/>
-          <w:szCs w:val="30"/>
-          <w14:ligatures w14:val="none"/>
-        </w:rPr>
-        <w:t>四是</w:t>
-      </w:r>
-      <w:r>
-        <w:rPr>
-          <w:rFonts w:ascii="仿宋" w:eastAsia="仿宋" w:hAnsi="仿宋" w:cs="Times New Roman"/>
-          <w:b/>
-          <w:bCs/>
-          <w:sz w:val="30"/>
-          <w:szCs w:val="30"/>
-          <w14:ligatures w14:val="none"/>
-        </w:rPr>
-        <w:t>坚持安全经济，</w:t>
-      </w:r>
-      <w:r>
-        <w:rPr>
-          <w:rFonts w:ascii="仿宋" w:eastAsia="仿宋" w:hAnsi="仿宋" w:cs="Times New Roman"/>
-          <w:sz w:val="30"/>
-          <w:szCs w:val="30"/>
-          <w14:ligatures w14:val="none"/>
-        </w:rPr>
-        <w:t>大力发展非接触、自动化检测技术，降低作业风险</w:t>
-      </w:r>
-      <w:r>
-        <w:rPr>
-          <w:rFonts w:ascii="仿宋" w:eastAsia="仿宋" w:hAnsi="仿宋" w:cs="Times New Roman" w:hint="eastAsia"/>
-          <w:sz w:val="30"/>
-          <w:szCs w:val="30"/>
-          <w14:ligatures w14:val="none"/>
-        </w:rPr>
-        <w:t>，并积极探索轻量化、低成本的检测模式，</w:t>
-      </w:r>
-      <w:proofErr w:type="gramStart"/>
-      <w:r>
-        <w:rPr>
-          <w:rFonts w:ascii="仿宋" w:eastAsia="仿宋" w:hAnsi="仿宋" w:cs="Times New Roman" w:hint="eastAsia"/>
-          <w:sz w:val="30"/>
-          <w:szCs w:val="30"/>
-          <w14:ligatures w14:val="none"/>
-        </w:rPr>
-        <w:t>平衡技术</w:t>
-      </w:r>
-      <w:proofErr w:type="gramEnd"/>
-      <w:r>
-        <w:rPr>
-          <w:rFonts w:ascii="仿宋" w:eastAsia="仿宋" w:hAnsi="仿宋" w:cs="Times New Roman" w:hint="eastAsia"/>
-          <w:sz w:val="30"/>
-          <w:szCs w:val="30"/>
-          <w14:ligatures w14:val="none"/>
-        </w:rPr>
-        <w:t>先进性与经济可行性。</w:t>
+          <w:sz w:val="30"/>
+          <w:szCs w:val="30"/>
+          <w14:ligatures w14:val="none"/>
+        </w:rPr>
+        <w:t>，并积极探索轻量化、低成本的检测模式，平衡技术先进性与经济可行性。</w:t>
       </w:r>
     </w:p>
     <w:p>
@@ -870,7 +816,7 @@
         <w:spacing w:after="0" w:line="560" w:lineRule="exact"/>
         <w:jc w:val="both"/>
         <w:rPr>
-          <w:rFonts w:ascii="楷体" w:eastAsia="楷体" w:hAnsi="楷体" w:cs="Times New Roman" w:hint="eastAsia"/>
+          <w:rFonts w:ascii="楷体" w:eastAsia="楷体" w:hAnsi="楷体" w:cs="Times New Roman"/>
           <w:b/>
           <w:bCs/>
           <w:sz w:val="32"/>
@@ -1081,12 +1027,34 @@
         <w:ind w:firstLineChars="200" w:firstLine="602"/>
         <w:jc w:val="both"/>
         <w:rPr>
+          <w:rFonts w:ascii="仿宋" w:eastAsia="仿宋" w:hAnsi="仿宋" w:cs="Times New Roman"/>
+          <w:sz w:val="30"/>
+          <w:szCs w:val="30"/>
+          <w14:ligatures w14:val="none"/>
+        </w:rPr>
+      </w:pPr>
+      <w:r>
+        <w:rPr>
           <w:rFonts w:ascii="仿宋" w:eastAsia="仿宋" w:hAnsi="仿宋" w:cs="Times New Roman" w:hint="eastAsia"/>
-          <w:sz w:val="30"/>
-          <w:szCs w:val="30"/>
-          <w14:ligatures w14:val="none"/>
-        </w:rPr>
-      </w:pPr>
+          <w:b/>
+          <w:bCs/>
+          <w:sz w:val="30"/>
+          <w:szCs w:val="30"/>
+          <w14:ligatures w14:val="none"/>
+        </w:rPr>
+        <w:t>四是</w:t>
+      </w:r>
+      <w:r>
+        <w:rPr>
+          <w:rFonts w:ascii="仿宋" w:eastAsia="仿宋" w:hAnsi="仿宋" w:cs="Times New Roman"/>
+          <w:b/>
+          <w:bCs/>
+          <w:sz w:val="30"/>
+          <w:szCs w:val="30"/>
+          <w14:ligatures w14:val="none"/>
+        </w:rPr>
+        <w:t>建立“云-</w:t>
+      </w:r>
       <w:r>
         <w:rPr>
           <w:rFonts w:ascii="仿宋" w:eastAsia="仿宋" w:hAnsi="仿宋" w:cs="Times New Roman" w:hint="eastAsia"/>
@@ -1096,18 +1064,18 @@
           <w:szCs w:val="30"/>
           <w14:ligatures w14:val="none"/>
         </w:rPr>
-        <w:t>四是</w:t>
-      </w:r>
-      <w:r>
-        <w:rPr>
-          <w:rFonts w:ascii="仿宋" w:eastAsia="仿宋" w:hAnsi="仿宋" w:cs="Times New Roman"/>
-          <w:b/>
-          <w:bCs/>
-          <w:sz w:val="30"/>
-          <w:szCs w:val="30"/>
-          <w14:ligatures w14:val="none"/>
-        </w:rPr>
-        <w:t>建立“云-</w:t>
+        <w:t>边</w:t>
+      </w:r>
+      <w:r>
+        <w:rPr>
+          <w:rFonts w:ascii="仿宋" w:eastAsia="仿宋" w:hAnsi="仿宋" w:cs="Times New Roman"/>
+          <w:b/>
+          <w:bCs/>
+          <w:sz w:val="30"/>
+          <w:szCs w:val="30"/>
+          <w14:ligatures w14:val="none"/>
+        </w:rPr>
+        <w:t>-端”协同的应用模式</w:t>
       </w:r>
       <w:r>
         <w:rPr>
@@ -1118,28 +1086,6 @@
           <w:szCs w:val="30"/>
           <w14:ligatures w14:val="none"/>
         </w:rPr>
-        <w:t>边</w:t>
-      </w:r>
-      <w:r>
-        <w:rPr>
-          <w:rFonts w:ascii="仿宋" w:eastAsia="仿宋" w:hAnsi="仿宋" w:cs="Times New Roman"/>
-          <w:b/>
-          <w:bCs/>
-          <w:sz w:val="30"/>
-          <w:szCs w:val="30"/>
-          <w14:ligatures w14:val="none"/>
-        </w:rPr>
-        <w:t>-端”协同的应用模式</w:t>
-      </w:r>
-      <w:r>
-        <w:rPr>
-          <w:rFonts w:ascii="仿宋" w:eastAsia="仿宋" w:hAnsi="仿宋" w:cs="Times New Roman" w:hint="eastAsia"/>
-          <w:b/>
-          <w:bCs/>
-          <w:sz w:val="30"/>
-          <w:szCs w:val="30"/>
-          <w14:ligatures w14:val="none"/>
-        </w:rPr>
         <w:t>。</w:t>
       </w:r>
       <w:r>
@@ -1149,27 +1095,7 @@
           <w:szCs w:val="30"/>
           <w14:ligatures w14:val="none"/>
         </w:rPr>
-        <w:t>在采集设备端、路侧边缘和</w:t>
-      </w:r>
-      <w:proofErr w:type="gramStart"/>
-      <w:r>
-        <w:rPr>
-          <w:rFonts w:ascii="仿宋" w:eastAsia="仿宋" w:hAnsi="仿宋" w:cs="Times New Roman"/>
-          <w:sz w:val="30"/>
-          <w:szCs w:val="30"/>
-          <w14:ligatures w14:val="none"/>
-        </w:rPr>
-        <w:t>云中心</w:t>
-      </w:r>
-      <w:proofErr w:type="gramEnd"/>
-      <w:r>
-        <w:rPr>
-          <w:rFonts w:ascii="仿宋" w:eastAsia="仿宋" w:hAnsi="仿宋" w:cs="Times New Roman"/>
-          <w:sz w:val="30"/>
-          <w:szCs w:val="30"/>
-          <w14:ligatures w14:val="none"/>
-        </w:rPr>
-        <w:t>进行合理的功能分工，以平衡实时性、成本和计算负荷，推动智能检测技术的规模化落地。</w:t>
+        <w:t>在采集设备端、路侧边缘和云中心进行合理的功能分工，以平衡实时性、成本和计算负荷，推动智能检测技术的规模化落地。</w:t>
       </w:r>
     </w:p>
     <w:sectPr>

</xml_diff>